<commit_message>
Hide DIARY PROJECT PLAY.docx file
Hide DIARY PROJECT PLAY.docx file as I don't like it to be public
</commit_message>
<xml_diff>
--- a/narrative/DIARY PROJECT PLAY.docx
+++ b/narrative/DIARY PROJECT PLAY.docx
@@ -42,7 +42,15 @@
         <w:t>raw MCDI dataset</w:t>
       </w:r>
       <w:r>
-        <w:t xml:space="preserve"> (CSV file from Wordbank) into R and stored it in the data folder.</w:t>
+        <w:t xml:space="preserve"> (CSV file from </w:t>
+      </w:r>
+      <w:proofErr w:type="spellStart"/>
+      <w:r>
+        <w:t>Wordbank</w:t>
+      </w:r>
+      <w:proofErr w:type="spellEnd"/>
+      <w:r>
+        <w:t>) into R and stored it in the data folder.</w:t>
       </w:r>
     </w:p>
     <w:p>
@@ -235,7 +243,23 @@
           <w:b/>
           <w:bCs/>
         </w:rPr>
-        <w:t>Random effect capture vriability of item difficulty</w:t>
+        <w:t xml:space="preserve">Random effect capture </w:t>
+      </w:r>
+      <w:proofErr w:type="spellStart"/>
+      <w:r>
+        <w:rPr>
+          <w:b/>
+          <w:bCs/>
+        </w:rPr>
+        <w:t>vriability</w:t>
+      </w:r>
+      <w:proofErr w:type="spellEnd"/>
+      <w:r>
+        <w:rPr>
+          <w:b/>
+          <w:bCs/>
+        </w:rPr>
+        <w:t xml:space="preserve"> of item difficulty</w:t>
       </w:r>
     </w:p>
     <w:p>
@@ -309,13 +333,25 @@
         </w:rPr>
         <w:t xml:space="preserve"> </w:t>
       </w:r>
-      <w:r>
-        <w:rPr>
-          <w:b/>
-          <w:bCs/>
-        </w:rPr>
-        <w:t>anova(</w:t>
-      </w:r>
+      <w:proofErr w:type="spellStart"/>
+      <w:proofErr w:type="gramStart"/>
+      <w:r>
+        <w:rPr>
+          <w:b/>
+          <w:bCs/>
+        </w:rPr>
+        <w:t>anova</w:t>
+      </w:r>
+      <w:proofErr w:type="spellEnd"/>
+      <w:r>
+        <w:rPr>
+          <w:b/>
+          <w:bCs/>
+        </w:rPr>
+        <w:t>(</w:t>
+      </w:r>
+      <w:proofErr w:type="spellStart"/>
+      <w:proofErr w:type="gramEnd"/>
       <w:r>
         <w:rPr>
           <w:b/>
@@ -324,6 +360,7 @@
         </w:rPr>
         <w:t>mixed_log_reg</w:t>
       </w:r>
+      <w:proofErr w:type="spellEnd"/>
       <w:r>
         <w:rPr>
           <w:b/>
@@ -331,6 +368,7 @@
         </w:rPr>
         <w:t xml:space="preserve">, </w:t>
       </w:r>
+      <w:proofErr w:type="spellStart"/>
       <w:r>
         <w:rPr>
           <w:b/>
@@ -339,6 +377,7 @@
         </w:rPr>
         <w:t>mixed_log_reg_nonlinear</w:t>
       </w:r>
+      <w:proofErr w:type="spellEnd"/>
       <w:r>
         <w:rPr>
           <w:b/>
@@ -366,6 +405,7 @@
           <w:bCs/>
         </w:rPr>
       </w:pPr>
+      <w:proofErr w:type="spellStart"/>
       <w:r>
         <w:rPr>
           <w:b/>
@@ -374,6 +414,7 @@
         </w:rPr>
         <w:t>mixed_log_reg</w:t>
       </w:r>
+      <w:proofErr w:type="spellEnd"/>
       <w:r>
         <w:rPr>
           <w:b/>
@@ -386,7 +427,31 @@
           <w:b/>
           <w:bCs/>
         </w:rPr>
-        <w:t>RANDOM INTERCEPTS MODEL            --&gt;  VARIABILITY OF WORDS &amp; CHILD</w:t>
+        <w:t>RANDOM INTERCEPTS MODEL            --</w:t>
+      </w:r>
+      <w:proofErr w:type="gramStart"/>
+      <w:r>
+        <w:rPr>
+          <w:b/>
+          <w:bCs/>
+        </w:rPr>
+        <w:t>&gt;  VARIABILITY</w:t>
+      </w:r>
+      <w:proofErr w:type="gramEnd"/>
+      <w:r>
+        <w:rPr>
+          <w:b/>
+          <w:bCs/>
+        </w:rPr>
+        <w:t xml:space="preserve"> OF WORDS &amp; </w:t>
+      </w:r>
+      <w:proofErr w:type="gramStart"/>
+      <w:r>
+        <w:rPr>
+          <w:b/>
+          <w:bCs/>
+        </w:rPr>
+        <w:t>CHILD</w:t>
       </w:r>
       <w:r>
         <w:rPr>
@@ -395,6 +460,7 @@
         </w:rPr>
         <w:t xml:space="preserve">  (</w:t>
       </w:r>
+      <w:proofErr w:type="gramEnd"/>
       <w:r>
         <w:rPr>
           <w:b/>
@@ -423,6 +489,7 @@
           <w:bCs/>
         </w:rPr>
       </w:pPr>
+      <w:proofErr w:type="spellStart"/>
       <w:r>
         <w:rPr>
           <w:b/>
@@ -431,6 +498,7 @@
         </w:rPr>
         <w:t>mixed_log_reg_nonlinear</w:t>
       </w:r>
+      <w:proofErr w:type="spellEnd"/>
       <w:r>
         <w:rPr>
           <w:b/>
@@ -443,7 +511,31 @@
           <w:b/>
           <w:bCs/>
         </w:rPr>
-        <w:t>RANDOM INTERCEPTS MODEL            --&gt;  VARIABILITY OF WORDS &amp; CHILD</w:t>
+        <w:t>RANDOM INTERCEPTS MODEL            --</w:t>
+      </w:r>
+      <w:proofErr w:type="gramStart"/>
+      <w:r>
+        <w:rPr>
+          <w:b/>
+          <w:bCs/>
+        </w:rPr>
+        <w:t>&gt;  VARIABILITY</w:t>
+      </w:r>
+      <w:proofErr w:type="gramEnd"/>
+      <w:r>
+        <w:rPr>
+          <w:b/>
+          <w:bCs/>
+        </w:rPr>
+        <w:t xml:space="preserve"> OF WORDS &amp; </w:t>
+      </w:r>
+      <w:proofErr w:type="gramStart"/>
+      <w:r>
+        <w:rPr>
+          <w:b/>
+          <w:bCs/>
+        </w:rPr>
+        <w:t>CHILD</w:t>
       </w:r>
       <w:r>
         <w:rPr>
@@ -452,6 +544,7 @@
         </w:rPr>
         <w:t xml:space="preserve">  (</w:t>
       </w:r>
+      <w:proofErr w:type="gramEnd"/>
       <w:r>
         <w:rPr>
           <w:b/>
@@ -763,8 +856,27 @@
           <w:b/>
           <w:bCs/>
         </w:rPr>
-        <w:t xml:space="preserve"> anova(</w:t>
-      </w:r>
+        <w:t xml:space="preserve"> </w:t>
+      </w:r>
+      <w:proofErr w:type="spellStart"/>
+      <w:proofErr w:type="gramStart"/>
+      <w:r>
+        <w:rPr>
+          <w:b/>
+          <w:bCs/>
+        </w:rPr>
+        <w:t>anova</w:t>
+      </w:r>
+      <w:proofErr w:type="spellEnd"/>
+      <w:r>
+        <w:rPr>
+          <w:b/>
+          <w:bCs/>
+        </w:rPr>
+        <w:t>(</w:t>
+      </w:r>
+      <w:proofErr w:type="spellStart"/>
+      <w:proofErr w:type="gramEnd"/>
       <w:r>
         <w:rPr>
           <w:b/>
@@ -773,6 +885,7 @@
         </w:rPr>
         <w:t>mixed_log_reg</w:t>
       </w:r>
+      <w:proofErr w:type="spellEnd"/>
       <w:r>
         <w:rPr>
           <w:b/>
@@ -780,6 +893,7 @@
         </w:rPr>
         <w:t xml:space="preserve">, </w:t>
       </w:r>
+      <w:proofErr w:type="spellStart"/>
       <w:r>
         <w:rPr>
           <w:b/>
@@ -788,6 +902,7 @@
         </w:rPr>
         <w:t>mixed_log_reg_nonlinear</w:t>
       </w:r>
+      <w:proofErr w:type="spellEnd"/>
       <w:r>
         <w:rPr>
           <w:b/>
@@ -808,6 +923,7 @@
           <w:bCs/>
         </w:rPr>
       </w:pPr>
+      <w:proofErr w:type="spellStart"/>
       <w:r>
         <w:rPr>
           <w:b/>
@@ -816,6 +932,7 @@
         </w:rPr>
         <w:t>mixed_log_reg</w:t>
       </w:r>
+      <w:proofErr w:type="spellEnd"/>
       <w:r>
         <w:rPr>
           <w:b/>
@@ -828,7 +945,31 @@
           <w:b/>
           <w:bCs/>
         </w:rPr>
-        <w:t>RANDOM INTERCEPTS MODEL            --&gt;  VARIABILITY OF WORDS &amp; CHILD</w:t>
+        <w:t>RANDOM INTERCEPTS MODEL            --</w:t>
+      </w:r>
+      <w:proofErr w:type="gramStart"/>
+      <w:r>
+        <w:rPr>
+          <w:b/>
+          <w:bCs/>
+        </w:rPr>
+        <w:t>&gt;  VARIABILITY</w:t>
+      </w:r>
+      <w:proofErr w:type="gramEnd"/>
+      <w:r>
+        <w:rPr>
+          <w:b/>
+          <w:bCs/>
+        </w:rPr>
+        <w:t xml:space="preserve"> OF WORDS &amp; </w:t>
+      </w:r>
+      <w:proofErr w:type="gramStart"/>
+      <w:r>
+        <w:rPr>
+          <w:b/>
+          <w:bCs/>
+        </w:rPr>
+        <w:t>CHILD</w:t>
       </w:r>
       <w:r>
         <w:rPr>
@@ -837,6 +978,7 @@
         </w:rPr>
         <w:t xml:space="preserve">  (</w:t>
       </w:r>
+      <w:proofErr w:type="gramEnd"/>
       <w:r>
         <w:rPr>
           <w:b/>
@@ -865,6 +1007,7 @@
           <w:bCs/>
         </w:rPr>
       </w:pPr>
+      <w:proofErr w:type="spellStart"/>
       <w:r>
         <w:rPr>
           <w:b/>
@@ -873,6 +1016,7 @@
         </w:rPr>
         <w:t>mixed_log_reg_nonlinear</w:t>
       </w:r>
+      <w:proofErr w:type="spellEnd"/>
       <w:r>
         <w:rPr>
           <w:b/>
@@ -885,7 +1029,31 @@
           <w:b/>
           <w:bCs/>
         </w:rPr>
-        <w:t>RANDOM INTERCEPTS MODEL            --&gt;  VARIABILITY OF WORDS &amp; CHILD</w:t>
+        <w:t>RANDOM INTERCEPTS MODEL            --</w:t>
+      </w:r>
+      <w:proofErr w:type="gramStart"/>
+      <w:r>
+        <w:rPr>
+          <w:b/>
+          <w:bCs/>
+        </w:rPr>
+        <w:t>&gt;  VARIABILITY</w:t>
+      </w:r>
+      <w:proofErr w:type="gramEnd"/>
+      <w:r>
+        <w:rPr>
+          <w:b/>
+          <w:bCs/>
+        </w:rPr>
+        <w:t xml:space="preserve"> OF WORDS &amp; </w:t>
+      </w:r>
+      <w:proofErr w:type="gramStart"/>
+      <w:r>
+        <w:rPr>
+          <w:b/>
+          <w:bCs/>
+        </w:rPr>
+        <w:t>CHILD</w:t>
       </w:r>
       <w:r>
         <w:rPr>
@@ -894,6 +1062,7 @@
         </w:rPr>
         <w:t xml:space="preserve">  (</w:t>
       </w:r>
+      <w:proofErr w:type="gramEnd"/>
       <w:r>
         <w:rPr>
           <w:b/>
@@ -955,8 +1124,17 @@
           <w:b/>
           <w:bCs/>
         </w:rPr>
-        <w:t>Copy Layla’s Rscript</w:t>
-      </w:r>
+        <w:t xml:space="preserve">Copy Layla’s </w:t>
+      </w:r>
+      <w:proofErr w:type="spellStart"/>
+      <w:r>
+        <w:rPr>
+          <w:b/>
+          <w:bCs/>
+        </w:rPr>
+        <w:t>Rscript</w:t>
+      </w:r>
+      <w:proofErr w:type="spellEnd"/>
     </w:p>
     <w:p>
       <w:pPr>
@@ -1041,6 +1219,7 @@
         </w:rPr>
         <w:t xml:space="preserve">reate a </w:t>
       </w:r>
+      <w:proofErr w:type="spellStart"/>
       <w:r>
         <w:rPr>
           <w:b/>
@@ -1049,6 +1228,7 @@
         </w:rPr>
         <w:t>summary_table</w:t>
       </w:r>
+      <w:proofErr w:type="spellEnd"/>
       <w:r>
         <w:rPr>
           <w:b/>
@@ -1062,7 +1242,25 @@
           <w:bCs/>
           <w:highlight w:val="yellow"/>
         </w:rPr>
-        <w:t>|word| aoa_fit|</w:t>
+        <w:t xml:space="preserve">|word| </w:t>
+      </w:r>
+      <w:proofErr w:type="spellStart"/>
+      <w:r>
+        <w:rPr>
+          <w:b/>
+          <w:bCs/>
+          <w:highlight w:val="yellow"/>
+        </w:rPr>
+        <w:t>aoa_fit</w:t>
+      </w:r>
+      <w:proofErr w:type="spellEnd"/>
+      <w:r>
+        <w:rPr>
+          <w:b/>
+          <w:bCs/>
+          <w:highlight w:val="yellow"/>
+        </w:rPr>
+        <w:t>|</w:t>
       </w:r>
       <w:r>
         <w:rPr>
@@ -1078,6 +1276,7 @@
         </w:rPr>
         <w:t xml:space="preserve">from my </w:t>
       </w:r>
+      <w:proofErr w:type="spellStart"/>
       <w:r>
         <w:rPr>
           <w:b/>
@@ -1086,6 +1285,7 @@
         </w:rPr>
         <w:t>longitudinal_data</w:t>
       </w:r>
+      <w:proofErr w:type="spellEnd"/>
     </w:p>
     <w:p>
       <w:pPr>
@@ -1339,6 +1539,7 @@
         </w:rPr>
         <w:t xml:space="preserve">Change …. With my </w:t>
       </w:r>
+      <w:proofErr w:type="spellStart"/>
       <w:r>
         <w:rPr>
           <w:b/>
@@ -1347,6 +1548,7 @@
         </w:rPr>
         <w:t>summary_table</w:t>
       </w:r>
+      <w:proofErr w:type="spellEnd"/>
     </w:p>
     <w:p>
       <w:pPr>
@@ -1388,14 +1590,47 @@
           <w:bCs/>
           <w:highlight w:val="magenta"/>
         </w:rPr>
-        <w:t>context leverage</w:t>
-      </w:r>
-      <w:r>
-        <w:rPr>
-          <w:b/>
-          <w:bCs/>
-        </w:rPr>
-        <w:t xml:space="preserve"> . UNCHAGED --&gt; CONTEXT LEVERAGE</w:t>
+        <w:t xml:space="preserve">context </w:t>
+      </w:r>
+      <w:proofErr w:type="gramStart"/>
+      <w:r>
+        <w:rPr>
+          <w:b/>
+          <w:bCs/>
+          <w:highlight w:val="magenta"/>
+        </w:rPr>
+        <w:t>leverage</w:t>
+      </w:r>
+      <w:r>
+        <w:rPr>
+          <w:b/>
+          <w:bCs/>
+        </w:rPr>
+        <w:t xml:space="preserve"> .</w:t>
+      </w:r>
+      <w:proofErr w:type="gramEnd"/>
+      <w:r>
+        <w:rPr>
+          <w:b/>
+          <w:bCs/>
+        </w:rPr>
+        <w:t xml:space="preserve"> </w:t>
+      </w:r>
+      <w:proofErr w:type="spellStart"/>
+      <w:r>
+        <w:rPr>
+          <w:b/>
+          <w:bCs/>
+        </w:rPr>
+        <w:t>UNCHAGED</w:t>
+      </w:r>
+      <w:proofErr w:type="spellEnd"/>
+      <w:r>
+        <w:rPr>
+          <w:b/>
+          <w:bCs/>
+        </w:rPr>
+        <w:t xml:space="preserve"> --&gt; CONTEXT LEVERAGE</w:t>
       </w:r>
     </w:p>
     <w:p>
@@ -1474,13 +1709,23 @@
         </w:rPr>
         <w:t xml:space="preserve">merge </w:t>
       </w:r>
+      <w:proofErr w:type="spellStart"/>
       <w:r>
         <w:rPr>
           <w:b/>
           <w:bCs/>
           <w:highlight w:val="magenta"/>
         </w:rPr>
-        <w:t>overlap_aoa (CONTEXT LEVERAGE</w:t>
+        <w:t>overlap_aoa</w:t>
+      </w:r>
+      <w:proofErr w:type="spellEnd"/>
+      <w:r>
+        <w:rPr>
+          <w:b/>
+          <w:bCs/>
+          <w:highlight w:val="magenta"/>
+        </w:rPr>
+        <w:t xml:space="preserve"> (CONTEXT LEVERAGE</w:t>
       </w:r>
       <w:r>
         <w:rPr>
@@ -1489,6 +1734,7 @@
         </w:rPr>
         <w:t xml:space="preserve">) with the </w:t>
       </w:r>
+      <w:proofErr w:type="spellStart"/>
       <w:r>
         <w:rPr>
           <w:b/>
@@ -1513,6 +1759,7 @@
         </w:rPr>
         <w:t>nal_data</w:t>
       </w:r>
+      <w:proofErr w:type="spellEnd"/>
       <w:r>
         <w:rPr>
           <w:b/>
@@ -1727,219 +1974,723 @@
           <w:b/>
           <w:bCs/>
         </w:rPr>
-        <w:t># 1 - copy layla's script</w:t>
-      </w:r>
-    </w:p>
-    <w:p>
-      <w:pPr>
-        <w:spacing w:after="0"/>
-        <w:rPr>
-          <w:b/>
-          <w:bCs/>
-        </w:rPr>
-      </w:pPr>
-      <w:r>
-        <w:rPr>
-          <w:b/>
-          <w:bCs/>
-        </w:rPr>
-        <w:t># 2 - create summary_table (word, aoa_fit) from my longitudinal_data --&gt; USE DISTINCT to eliminate doubles</w:t>
-      </w:r>
-    </w:p>
-    <w:p>
-      <w:pPr>
-        <w:spacing w:after="0"/>
-        <w:rPr>
-          <w:b/>
-          <w:bCs/>
-        </w:rPr>
-      </w:pPr>
-      <w:r>
-        <w:rPr>
-          <w:b/>
-          <w:bCs/>
-        </w:rPr>
-        <w:t># 3 - start calculating CONTXT LEVERAGE using my summary_data</w:t>
-      </w:r>
-    </w:p>
-    <w:p>
-      <w:pPr>
-        <w:spacing w:after="0"/>
-        <w:rPr>
-          <w:b/>
-          <w:bCs/>
-        </w:rPr>
-      </w:pPr>
-    </w:p>
-    <w:p>
-      <w:pPr>
-        <w:spacing w:after="0"/>
-        <w:rPr>
-          <w:b/>
-          <w:bCs/>
-        </w:rPr>
-      </w:pPr>
-      <w:r>
-        <w:rPr>
-          <w:b/>
-          <w:bCs/>
-        </w:rPr>
-        <w:t># Combine dataframe containing context overlap between word pairs</w:t>
-      </w:r>
-    </w:p>
-    <w:p>
-      <w:pPr>
-        <w:spacing w:after="0"/>
-        <w:rPr>
-          <w:b/>
-          <w:bCs/>
-        </w:rPr>
-      </w:pPr>
-      <w:r>
-        <w:rPr>
-          <w:b/>
-          <w:bCs/>
-        </w:rPr>
-        <w:t># with AoA (age of acquisiton) for each word in each pair</w:t>
-      </w:r>
-    </w:p>
-    <w:p>
-      <w:pPr>
-        <w:spacing w:after="0"/>
-        <w:rPr>
-          <w:b/>
-          <w:bCs/>
-        </w:rPr>
-      </w:pPr>
-      <w:r>
-        <w:rPr>
-          <w:b/>
-          <w:bCs/>
-        </w:rPr>
-        <w:t>overlap_aoa &lt;- overlap %&gt;%</w:t>
-      </w:r>
-    </w:p>
-    <w:p>
-      <w:pPr>
-        <w:spacing w:after="0"/>
-        <w:rPr>
-          <w:b/>
-          <w:bCs/>
-        </w:rPr>
-      </w:pPr>
-      <w:r>
-        <w:rPr>
-          <w:b/>
-          <w:bCs/>
-        </w:rPr>
-        <w:t xml:space="preserve">  left_join(dplyr::select(summary_table, word, aoa_fit), by = c("word1" = "word")) %&gt;%</w:t>
-      </w:r>
-    </w:p>
-    <w:p>
-      <w:pPr>
-        <w:spacing w:after="0"/>
-        <w:rPr>
-          <w:b/>
-          <w:bCs/>
-        </w:rPr>
-      </w:pPr>
-      <w:r>
-        <w:rPr>
-          <w:b/>
-          <w:bCs/>
-        </w:rPr>
-        <w:t xml:space="preserve">  dplyr::rename(aoa1 = aoa_fit) %&gt;%</w:t>
-      </w:r>
-    </w:p>
-    <w:p>
-      <w:pPr>
-        <w:spacing w:after="0"/>
-        <w:rPr>
-          <w:b/>
-          <w:bCs/>
-        </w:rPr>
-      </w:pPr>
-      <w:r>
-        <w:rPr>
-          <w:b/>
-          <w:bCs/>
-        </w:rPr>
-        <w:t xml:space="preserve">  left_join(dplyr::select(summary_table, word, aoa_fit), by = c("word2" = "word")) %&gt;%</w:t>
-      </w:r>
-    </w:p>
-    <w:p>
-      <w:pPr>
-        <w:spacing w:after="0"/>
-        <w:rPr>
-          <w:b/>
-          <w:bCs/>
-        </w:rPr>
-      </w:pPr>
-      <w:r>
-        <w:rPr>
-          <w:b/>
-          <w:bCs/>
-        </w:rPr>
-        <w:t xml:space="preserve">  dplyr::rename(aoa2 = aoa_fit)</w:t>
-      </w:r>
-    </w:p>
-    <w:p>
-      <w:pPr>
-        <w:spacing w:after="0"/>
-        <w:rPr>
-          <w:b/>
-          <w:bCs/>
-        </w:rPr>
-      </w:pPr>
-    </w:p>
-    <w:p>
-      <w:pPr>
-        <w:spacing w:after="0"/>
-        <w:rPr>
-          <w:b/>
-          <w:bCs/>
-        </w:rPr>
-      </w:pPr>
-    </w:p>
-    <w:p>
-      <w:pPr>
-        <w:spacing w:after="0"/>
-        <w:rPr>
-          <w:b/>
-          <w:bCs/>
-        </w:rPr>
-      </w:pPr>
-      <w:r>
-        <w:rPr>
-          <w:b/>
-          <w:bCs/>
-        </w:rPr>
-        <w:t># 4 - actual calculation UNCHAGED --&gt; CONTEXT LEVERAGE</w:t>
-      </w:r>
-    </w:p>
-    <w:p>
-      <w:pPr>
-        <w:spacing w:after="0"/>
-        <w:rPr>
-          <w:b/>
-          <w:bCs/>
-        </w:rPr>
-      </w:pPr>
-    </w:p>
-    <w:p>
-      <w:pPr>
-        <w:spacing w:after="0"/>
-        <w:rPr>
-          <w:b/>
-          <w:bCs/>
-        </w:rPr>
-      </w:pPr>
-      <w:r>
-        <w:rPr>
-          <w:b/>
-          <w:bCs/>
-        </w:rPr>
-        <w:t># 5 - - merge overlap_aoa (CONTEXT LEVERAGE) with the longitudnal_data --&gt; NEW BIT</w:t>
+        <w:t xml:space="preserve"># 1 - copy </w:t>
+      </w:r>
+      <w:proofErr w:type="spellStart"/>
+      <w:r>
+        <w:rPr>
+          <w:b/>
+          <w:bCs/>
+        </w:rPr>
+        <w:t>layla's</w:t>
+      </w:r>
+      <w:proofErr w:type="spellEnd"/>
+      <w:r>
+        <w:rPr>
+          <w:b/>
+          <w:bCs/>
+        </w:rPr>
+        <w:t xml:space="preserve"> script</w:t>
+      </w:r>
+    </w:p>
+    <w:p>
+      <w:pPr>
+        <w:spacing w:after="0"/>
+        <w:rPr>
+          <w:b/>
+          <w:bCs/>
+        </w:rPr>
+      </w:pPr>
+      <w:r>
+        <w:rPr>
+          <w:b/>
+          <w:bCs/>
+        </w:rPr>
+        <w:t xml:space="preserve"># 2 - create </w:t>
+      </w:r>
+      <w:proofErr w:type="spellStart"/>
+      <w:r>
+        <w:rPr>
+          <w:b/>
+          <w:bCs/>
+        </w:rPr>
+        <w:t>summary_table</w:t>
+      </w:r>
+      <w:proofErr w:type="spellEnd"/>
+      <w:r>
+        <w:rPr>
+          <w:b/>
+          <w:bCs/>
+        </w:rPr>
+        <w:t xml:space="preserve"> (word, </w:t>
+      </w:r>
+      <w:proofErr w:type="spellStart"/>
+      <w:r>
+        <w:rPr>
+          <w:b/>
+          <w:bCs/>
+        </w:rPr>
+        <w:t>aoa_fit</w:t>
+      </w:r>
+      <w:proofErr w:type="spellEnd"/>
+      <w:r>
+        <w:rPr>
+          <w:b/>
+          <w:bCs/>
+        </w:rPr>
+        <w:t xml:space="preserve">) from my </w:t>
+      </w:r>
+      <w:proofErr w:type="spellStart"/>
+      <w:r>
+        <w:rPr>
+          <w:b/>
+          <w:bCs/>
+        </w:rPr>
+        <w:t>longitudinal_data</w:t>
+      </w:r>
+      <w:proofErr w:type="spellEnd"/>
+      <w:r>
+        <w:rPr>
+          <w:b/>
+          <w:bCs/>
+        </w:rPr>
+        <w:t xml:space="preserve"> --&gt; USE DISTINCT to eliminate doubles</w:t>
+      </w:r>
+    </w:p>
+    <w:p>
+      <w:pPr>
+        <w:spacing w:after="0"/>
+        <w:rPr>
+          <w:b/>
+          <w:bCs/>
+        </w:rPr>
+      </w:pPr>
+      <w:r>
+        <w:rPr>
+          <w:b/>
+          <w:bCs/>
+        </w:rPr>
+        <w:t xml:space="preserve"># 3 - start calculating </w:t>
+      </w:r>
+      <w:proofErr w:type="spellStart"/>
+      <w:r>
+        <w:rPr>
+          <w:b/>
+          <w:bCs/>
+        </w:rPr>
+        <w:t>CONTXT</w:t>
+      </w:r>
+      <w:proofErr w:type="spellEnd"/>
+      <w:r>
+        <w:rPr>
+          <w:b/>
+          <w:bCs/>
+        </w:rPr>
+        <w:t xml:space="preserve"> LEVERAGE using my </w:t>
+      </w:r>
+      <w:proofErr w:type="spellStart"/>
+      <w:r>
+        <w:rPr>
+          <w:b/>
+          <w:bCs/>
+        </w:rPr>
+        <w:t>summary_data</w:t>
+      </w:r>
+      <w:proofErr w:type="spellEnd"/>
+    </w:p>
+    <w:p>
+      <w:pPr>
+        <w:spacing w:after="0"/>
+        <w:rPr>
+          <w:b/>
+          <w:bCs/>
+        </w:rPr>
+      </w:pPr>
+    </w:p>
+    <w:p>
+      <w:pPr>
+        <w:spacing w:after="0"/>
+        <w:rPr>
+          <w:b/>
+          <w:bCs/>
+        </w:rPr>
+      </w:pPr>
+      <w:r>
+        <w:rPr>
+          <w:b/>
+          <w:bCs/>
+        </w:rPr>
+        <w:t xml:space="preserve"># Combine </w:t>
+      </w:r>
+      <w:proofErr w:type="spellStart"/>
+      <w:r>
+        <w:rPr>
+          <w:b/>
+          <w:bCs/>
+        </w:rPr>
+        <w:t>dataframe</w:t>
+      </w:r>
+      <w:proofErr w:type="spellEnd"/>
+      <w:r>
+        <w:rPr>
+          <w:b/>
+          <w:bCs/>
+        </w:rPr>
+        <w:t xml:space="preserve"> containing context overlap between word pairs</w:t>
+      </w:r>
+    </w:p>
+    <w:p>
+      <w:pPr>
+        <w:spacing w:after="0"/>
+        <w:rPr>
+          <w:b/>
+          <w:bCs/>
+        </w:rPr>
+      </w:pPr>
+      <w:r>
+        <w:rPr>
+          <w:b/>
+          <w:bCs/>
+        </w:rPr>
+        <w:t xml:space="preserve"># with </w:t>
+      </w:r>
+      <w:proofErr w:type="spellStart"/>
+      <w:r>
+        <w:rPr>
+          <w:b/>
+          <w:bCs/>
+        </w:rPr>
+        <w:t>AoA</w:t>
+      </w:r>
+      <w:proofErr w:type="spellEnd"/>
+      <w:r>
+        <w:rPr>
+          <w:b/>
+          <w:bCs/>
+        </w:rPr>
+        <w:t xml:space="preserve"> (age of </w:t>
+      </w:r>
+      <w:proofErr w:type="spellStart"/>
+      <w:r>
+        <w:rPr>
+          <w:b/>
+          <w:bCs/>
+        </w:rPr>
+        <w:t>acquisiton</w:t>
+      </w:r>
+      <w:proofErr w:type="spellEnd"/>
+      <w:r>
+        <w:rPr>
+          <w:b/>
+          <w:bCs/>
+        </w:rPr>
+        <w:t>) for each word in each pair</w:t>
+      </w:r>
+    </w:p>
+    <w:p>
+      <w:pPr>
+        <w:spacing w:after="0"/>
+        <w:rPr>
+          <w:b/>
+          <w:bCs/>
+        </w:rPr>
+      </w:pPr>
+      <w:proofErr w:type="spellStart"/>
+      <w:r>
+        <w:rPr>
+          <w:b/>
+          <w:bCs/>
+        </w:rPr>
+        <w:t>overlap_aoa</w:t>
+      </w:r>
+      <w:proofErr w:type="spellEnd"/>
+      <w:r>
+        <w:rPr>
+          <w:b/>
+          <w:bCs/>
+        </w:rPr>
+        <w:t xml:space="preserve"> &lt;- overlap %&gt;%</w:t>
+      </w:r>
+    </w:p>
+    <w:p>
+      <w:pPr>
+        <w:spacing w:after="0"/>
+        <w:rPr>
+          <w:b/>
+          <w:bCs/>
+        </w:rPr>
+      </w:pPr>
+      <w:r>
+        <w:rPr>
+          <w:b/>
+          <w:bCs/>
+        </w:rPr>
+        <w:t xml:space="preserve">  </w:t>
+      </w:r>
+      <w:proofErr w:type="spellStart"/>
+      <w:r>
+        <w:rPr>
+          <w:b/>
+          <w:bCs/>
+        </w:rPr>
+        <w:t>left_</w:t>
+      </w:r>
+      <w:proofErr w:type="gramStart"/>
+      <w:r>
+        <w:rPr>
+          <w:b/>
+          <w:bCs/>
+        </w:rPr>
+        <w:t>join</w:t>
+      </w:r>
+      <w:proofErr w:type="spellEnd"/>
+      <w:r>
+        <w:rPr>
+          <w:b/>
+          <w:bCs/>
+        </w:rPr>
+        <w:t>(</w:t>
+      </w:r>
+      <w:proofErr w:type="spellStart"/>
+      <w:r>
+        <w:rPr>
+          <w:b/>
+          <w:bCs/>
+        </w:rPr>
+        <w:t>dplyr</w:t>
+      </w:r>
+      <w:proofErr w:type="spellEnd"/>
+      <w:r>
+        <w:rPr>
+          <w:b/>
+          <w:bCs/>
+        </w:rPr>
+        <w:t>::select(</w:t>
+      </w:r>
+      <w:proofErr w:type="spellStart"/>
+      <w:proofErr w:type="gramEnd"/>
+      <w:r>
+        <w:rPr>
+          <w:b/>
+          <w:bCs/>
+        </w:rPr>
+        <w:t>summary_table</w:t>
+      </w:r>
+      <w:proofErr w:type="spellEnd"/>
+      <w:r>
+        <w:rPr>
+          <w:b/>
+          <w:bCs/>
+        </w:rPr>
+        <w:t xml:space="preserve">, word, </w:t>
+      </w:r>
+      <w:proofErr w:type="spellStart"/>
+      <w:r>
+        <w:rPr>
+          <w:b/>
+          <w:bCs/>
+        </w:rPr>
+        <w:t>aoa_fit</w:t>
+      </w:r>
+      <w:proofErr w:type="spellEnd"/>
+      <w:r>
+        <w:rPr>
+          <w:b/>
+          <w:bCs/>
+        </w:rPr>
+        <w:t xml:space="preserve">), by = </w:t>
+      </w:r>
+      <w:proofErr w:type="gramStart"/>
+      <w:r>
+        <w:rPr>
+          <w:b/>
+          <w:bCs/>
+        </w:rPr>
+        <w:t>c(</w:t>
+      </w:r>
+      <w:proofErr w:type="gramEnd"/>
+      <w:r>
+        <w:rPr>
+          <w:b/>
+          <w:bCs/>
+        </w:rPr>
+        <w:t>"</w:t>
+      </w:r>
+      <w:proofErr w:type="spellStart"/>
+      <w:r>
+        <w:rPr>
+          <w:b/>
+          <w:bCs/>
+        </w:rPr>
+        <w:t>word1</w:t>
+      </w:r>
+      <w:proofErr w:type="spellEnd"/>
+      <w:r>
+        <w:rPr>
+          <w:b/>
+          <w:bCs/>
+        </w:rPr>
+        <w:t>" = "word")) %&gt;%</w:t>
+      </w:r>
+    </w:p>
+    <w:p>
+      <w:pPr>
+        <w:spacing w:after="0"/>
+        <w:rPr>
+          <w:b/>
+          <w:bCs/>
+        </w:rPr>
+      </w:pPr>
+      <w:r>
+        <w:rPr>
+          <w:b/>
+          <w:bCs/>
+        </w:rPr>
+        <w:t xml:space="preserve">  </w:t>
+      </w:r>
+      <w:proofErr w:type="spellStart"/>
+      <w:proofErr w:type="gramStart"/>
+      <w:r>
+        <w:rPr>
+          <w:b/>
+          <w:bCs/>
+        </w:rPr>
+        <w:t>dplyr</w:t>
+      </w:r>
+      <w:proofErr w:type="spellEnd"/>
+      <w:r>
+        <w:rPr>
+          <w:b/>
+          <w:bCs/>
+        </w:rPr>
+        <w:t>::rename(</w:t>
+      </w:r>
+      <w:proofErr w:type="spellStart"/>
+      <w:proofErr w:type="gramEnd"/>
+      <w:r>
+        <w:rPr>
+          <w:b/>
+          <w:bCs/>
+        </w:rPr>
+        <w:t>aoa1</w:t>
+      </w:r>
+      <w:proofErr w:type="spellEnd"/>
+      <w:r>
+        <w:rPr>
+          <w:b/>
+          <w:bCs/>
+        </w:rPr>
+        <w:t xml:space="preserve"> = </w:t>
+      </w:r>
+      <w:proofErr w:type="spellStart"/>
+      <w:r>
+        <w:rPr>
+          <w:b/>
+          <w:bCs/>
+        </w:rPr>
+        <w:t>aoa_fit</w:t>
+      </w:r>
+      <w:proofErr w:type="spellEnd"/>
+      <w:r>
+        <w:rPr>
+          <w:b/>
+          <w:bCs/>
+        </w:rPr>
+        <w:t>) %&gt;%</w:t>
+      </w:r>
+    </w:p>
+    <w:p>
+      <w:pPr>
+        <w:spacing w:after="0"/>
+        <w:rPr>
+          <w:b/>
+          <w:bCs/>
+        </w:rPr>
+      </w:pPr>
+      <w:r>
+        <w:rPr>
+          <w:b/>
+          <w:bCs/>
+        </w:rPr>
+        <w:t xml:space="preserve">  </w:t>
+      </w:r>
+      <w:proofErr w:type="spellStart"/>
+      <w:r>
+        <w:rPr>
+          <w:b/>
+          <w:bCs/>
+        </w:rPr>
+        <w:t>left_</w:t>
+      </w:r>
+      <w:proofErr w:type="gramStart"/>
+      <w:r>
+        <w:rPr>
+          <w:b/>
+          <w:bCs/>
+        </w:rPr>
+        <w:t>join</w:t>
+      </w:r>
+      <w:proofErr w:type="spellEnd"/>
+      <w:r>
+        <w:rPr>
+          <w:b/>
+          <w:bCs/>
+        </w:rPr>
+        <w:t>(</w:t>
+      </w:r>
+      <w:proofErr w:type="spellStart"/>
+      <w:r>
+        <w:rPr>
+          <w:b/>
+          <w:bCs/>
+        </w:rPr>
+        <w:t>dplyr</w:t>
+      </w:r>
+      <w:proofErr w:type="spellEnd"/>
+      <w:r>
+        <w:rPr>
+          <w:b/>
+          <w:bCs/>
+        </w:rPr>
+        <w:t>::select(</w:t>
+      </w:r>
+      <w:proofErr w:type="spellStart"/>
+      <w:proofErr w:type="gramEnd"/>
+      <w:r>
+        <w:rPr>
+          <w:b/>
+          <w:bCs/>
+        </w:rPr>
+        <w:t>summary_table</w:t>
+      </w:r>
+      <w:proofErr w:type="spellEnd"/>
+      <w:r>
+        <w:rPr>
+          <w:b/>
+          <w:bCs/>
+        </w:rPr>
+        <w:t xml:space="preserve">, word, </w:t>
+      </w:r>
+      <w:proofErr w:type="spellStart"/>
+      <w:r>
+        <w:rPr>
+          <w:b/>
+          <w:bCs/>
+        </w:rPr>
+        <w:t>aoa_fit</w:t>
+      </w:r>
+      <w:proofErr w:type="spellEnd"/>
+      <w:r>
+        <w:rPr>
+          <w:b/>
+          <w:bCs/>
+        </w:rPr>
+        <w:t xml:space="preserve">), by = </w:t>
+      </w:r>
+      <w:proofErr w:type="gramStart"/>
+      <w:r>
+        <w:rPr>
+          <w:b/>
+          <w:bCs/>
+        </w:rPr>
+        <w:t>c(</w:t>
+      </w:r>
+      <w:proofErr w:type="gramEnd"/>
+      <w:r>
+        <w:rPr>
+          <w:b/>
+          <w:bCs/>
+        </w:rPr>
+        <w:t>"</w:t>
+      </w:r>
+      <w:proofErr w:type="spellStart"/>
+      <w:r>
+        <w:rPr>
+          <w:b/>
+          <w:bCs/>
+        </w:rPr>
+        <w:t>word2</w:t>
+      </w:r>
+      <w:proofErr w:type="spellEnd"/>
+      <w:r>
+        <w:rPr>
+          <w:b/>
+          <w:bCs/>
+        </w:rPr>
+        <w:t>" = "word")) %&gt;%</w:t>
+      </w:r>
+    </w:p>
+    <w:p>
+      <w:pPr>
+        <w:spacing w:after="0"/>
+        <w:rPr>
+          <w:b/>
+          <w:bCs/>
+        </w:rPr>
+      </w:pPr>
+      <w:r>
+        <w:rPr>
+          <w:b/>
+          <w:bCs/>
+        </w:rPr>
+        <w:t xml:space="preserve">  </w:t>
+      </w:r>
+      <w:proofErr w:type="spellStart"/>
+      <w:proofErr w:type="gramStart"/>
+      <w:r>
+        <w:rPr>
+          <w:b/>
+          <w:bCs/>
+        </w:rPr>
+        <w:t>dplyr</w:t>
+      </w:r>
+      <w:proofErr w:type="spellEnd"/>
+      <w:r>
+        <w:rPr>
+          <w:b/>
+          <w:bCs/>
+        </w:rPr>
+        <w:t>::rename(</w:t>
+      </w:r>
+      <w:proofErr w:type="spellStart"/>
+      <w:proofErr w:type="gramEnd"/>
+      <w:r>
+        <w:rPr>
+          <w:b/>
+          <w:bCs/>
+        </w:rPr>
+        <w:t>aoa2</w:t>
+      </w:r>
+      <w:proofErr w:type="spellEnd"/>
+      <w:r>
+        <w:rPr>
+          <w:b/>
+          <w:bCs/>
+        </w:rPr>
+        <w:t xml:space="preserve"> = </w:t>
+      </w:r>
+      <w:proofErr w:type="spellStart"/>
+      <w:r>
+        <w:rPr>
+          <w:b/>
+          <w:bCs/>
+        </w:rPr>
+        <w:t>aoa_fit</w:t>
+      </w:r>
+      <w:proofErr w:type="spellEnd"/>
+      <w:r>
+        <w:rPr>
+          <w:b/>
+          <w:bCs/>
+        </w:rPr>
+        <w:t>)</w:t>
+      </w:r>
+    </w:p>
+    <w:p>
+      <w:pPr>
+        <w:spacing w:after="0"/>
+        <w:rPr>
+          <w:b/>
+          <w:bCs/>
+        </w:rPr>
+      </w:pPr>
+    </w:p>
+    <w:p>
+      <w:pPr>
+        <w:spacing w:after="0"/>
+        <w:rPr>
+          <w:b/>
+          <w:bCs/>
+        </w:rPr>
+      </w:pPr>
+    </w:p>
+    <w:p>
+      <w:pPr>
+        <w:spacing w:after="0"/>
+        <w:rPr>
+          <w:b/>
+          <w:bCs/>
+        </w:rPr>
+      </w:pPr>
+      <w:r>
+        <w:rPr>
+          <w:b/>
+          <w:bCs/>
+        </w:rPr>
+        <w:t xml:space="preserve"># 4 - actual calculation </w:t>
+      </w:r>
+      <w:proofErr w:type="spellStart"/>
+      <w:r>
+        <w:rPr>
+          <w:b/>
+          <w:bCs/>
+        </w:rPr>
+        <w:t>UNCHAGED</w:t>
+      </w:r>
+      <w:proofErr w:type="spellEnd"/>
+      <w:r>
+        <w:rPr>
+          <w:b/>
+          <w:bCs/>
+        </w:rPr>
+        <w:t xml:space="preserve"> --&gt; CONTEXT LEVERAGE</w:t>
+      </w:r>
+    </w:p>
+    <w:p>
+      <w:pPr>
+        <w:spacing w:after="0"/>
+        <w:rPr>
+          <w:b/>
+          <w:bCs/>
+        </w:rPr>
+      </w:pPr>
+    </w:p>
+    <w:p>
+      <w:pPr>
+        <w:spacing w:after="0"/>
+        <w:rPr>
+          <w:b/>
+          <w:bCs/>
+        </w:rPr>
+      </w:pPr>
+      <w:r>
+        <w:rPr>
+          <w:b/>
+          <w:bCs/>
+        </w:rPr>
+        <w:t xml:space="preserve"># 5 - - merge </w:t>
+      </w:r>
+      <w:proofErr w:type="spellStart"/>
+      <w:r>
+        <w:rPr>
+          <w:b/>
+          <w:bCs/>
+        </w:rPr>
+        <w:t>overlap_aoa</w:t>
+      </w:r>
+      <w:proofErr w:type="spellEnd"/>
+      <w:r>
+        <w:rPr>
+          <w:b/>
+          <w:bCs/>
+        </w:rPr>
+        <w:t xml:space="preserve"> (CONTEXT LEVERAGE) with the </w:t>
+      </w:r>
+      <w:proofErr w:type="spellStart"/>
+      <w:r>
+        <w:rPr>
+          <w:b/>
+          <w:bCs/>
+        </w:rPr>
+        <w:t>longitudnal_data</w:t>
+      </w:r>
+      <w:proofErr w:type="spellEnd"/>
+      <w:r>
+        <w:rPr>
+          <w:b/>
+          <w:bCs/>
+        </w:rPr>
+        <w:t xml:space="preserve"> --&gt; NEW BIT</w:t>
       </w:r>
     </w:p>
     <w:p>
@@ -2020,8 +2771,13 @@
       <w:r>
         <w:t xml:space="preserve"> </w:t>
       </w:r>
-      <w:r>
-        <w:t>-  scaling all the vars</w:t>
+      <w:proofErr w:type="gramStart"/>
+      <w:r>
+        <w:t>-  scaling</w:t>
+      </w:r>
+      <w:proofErr w:type="gramEnd"/>
+      <w:r>
+        <w:t xml:space="preserve"> all the vars</w:t>
       </w:r>
       <w:r>
         <w:t xml:space="preserve"> (z-scores) – WE SHOULDN’T SCALE </w:t>
@@ -2033,7 +2789,28 @@
         <w:t>AGE</w:t>
       </w:r>
       <w:r>
-        <w:t xml:space="preserve"> because it is a baeline var predictor. We don’t use it to compare it with other variables but rather it is a our focus predictor </w:t>
+        <w:t xml:space="preserve"> because it is a </w:t>
+      </w:r>
+      <w:proofErr w:type="spellStart"/>
+      <w:r>
+        <w:t>baeline</w:t>
+      </w:r>
+      <w:proofErr w:type="spellEnd"/>
+      <w:r>
+        <w:t xml:space="preserve"> var predictor. We don’t use it to compare it with other variables but rather it is </w:t>
+      </w:r>
+      <w:proofErr w:type="spellStart"/>
+      <w:proofErr w:type="gramStart"/>
+      <w:r>
+        <w:t>a</w:t>
+      </w:r>
+      <w:proofErr w:type="spellEnd"/>
+      <w:r>
+        <w:t xml:space="preserve"> our</w:t>
+      </w:r>
+      <w:proofErr w:type="gramEnd"/>
+      <w:r>
+        <w:t xml:space="preserve"> focus predictor </w:t>
       </w:r>
     </w:p>
     <w:p>
@@ -2200,10 +2977,21 @@
         <w:rPr>
           <w:highlight w:val="green"/>
         </w:rPr>
-        <w:t>INCLUDE COMPARISON BETWEEN MODELS</w:t>
-      </w:r>
-      <w:r>
-        <w:t xml:space="preserve">  RUN THE COMPARISON </w:t>
+        <w:t xml:space="preserve">INCLUDE COMPARISON BETWEEN </w:t>
+      </w:r>
+      <w:proofErr w:type="gramStart"/>
+      <w:r>
+        <w:rPr>
+          <w:highlight w:val="green"/>
+        </w:rPr>
+        <w:t>MODELS</w:t>
+      </w:r>
+      <w:r>
+        <w:t xml:space="preserve">  RUN</w:t>
+      </w:r>
+      <w:proofErr w:type="gramEnd"/>
+      <w:r>
+        <w:t xml:space="preserve"> THE COMPARISON </w:t>
       </w:r>
     </w:p>
     <w:p>
@@ -2390,7 +3178,29 @@
           <w:highlight w:val="yellow"/>
         </w:rPr>
         <w:lastRenderedPageBreak/>
-        <w:t>USING glmer()</w:t>
+        <w:t xml:space="preserve">USING </w:t>
+      </w:r>
+      <w:proofErr w:type="spellStart"/>
+      <w:proofErr w:type="gramStart"/>
+      <w:r>
+        <w:rPr>
+          <w:highlight w:val="yellow"/>
+        </w:rPr>
+        <w:t>glmer</w:t>
+      </w:r>
+      <w:proofErr w:type="spellEnd"/>
+      <w:r>
+        <w:rPr>
+          <w:highlight w:val="yellow"/>
+        </w:rPr>
+        <w:t>(</w:t>
+      </w:r>
+      <w:proofErr w:type="gramEnd"/>
+      <w:r>
+        <w:rPr>
+          <w:highlight w:val="yellow"/>
+        </w:rPr>
+        <w:t>)</w:t>
       </w:r>
       <w:r>
         <w:t xml:space="preserve"> </w:t>
@@ -2411,7 +3221,21 @@
         <w:rPr>
           <w:highlight w:val="yellow"/>
         </w:rPr>
-        <w:t>AGE NON LINEAR PREDICTOR</w:t>
+        <w:t xml:space="preserve">AGE </w:t>
+      </w:r>
+      <w:proofErr w:type="gramStart"/>
+      <w:r>
+        <w:rPr>
+          <w:highlight w:val="yellow"/>
+        </w:rPr>
+        <w:t>NON LINEAR</w:t>
+      </w:r>
+      <w:proofErr w:type="gramEnd"/>
+      <w:r>
+        <w:rPr>
+          <w:highlight w:val="yellow"/>
+        </w:rPr>
+        <w:t xml:space="preserve"> PREDICTOR</w:t>
       </w:r>
       <w:r>
         <w:t xml:space="preserve"> </w:t>
@@ -2502,7 +3326,23 @@
         <w:spacing w:after="0"/>
       </w:pPr>
       <w:r>
-        <w:t>ADDING CONFOUNDING VARS and also CONTEXT LEVERAGE (overlap_wthin)</w:t>
+        <w:t xml:space="preserve">ADDING CONFOUNDING VARS </w:t>
+      </w:r>
+      <w:proofErr w:type="gramStart"/>
+      <w:r>
+        <w:t>and also</w:t>
+      </w:r>
+      <w:proofErr w:type="gramEnd"/>
+      <w:r>
+        <w:t xml:space="preserve"> CONTEXT LEVERAGE (</w:t>
+      </w:r>
+      <w:proofErr w:type="spellStart"/>
+      <w:r>
+        <w:t>overlap_wthin</w:t>
+      </w:r>
+      <w:proofErr w:type="spellEnd"/>
+      <w:r>
+        <w:t>)</w:t>
       </w:r>
     </w:p>
     <w:p>
@@ -2606,7 +3446,15 @@
         <w:spacing w:after="0"/>
       </w:pPr>
       <w:r>
-        <w:t xml:space="preserve">LOOK AT INTERACTIONS BETWEEN AGE AND each one of the confounding variable </w:t>
+        <w:t xml:space="preserve">LOOK AT INTERACTIONS BETWEEN AGE AND each one of the confounding </w:t>
+      </w:r>
+      <w:proofErr w:type="gramStart"/>
+      <w:r>
+        <w:t>variable</w:t>
+      </w:r>
+      <w:proofErr w:type="gramEnd"/>
+      <w:r>
+        <w:t xml:space="preserve"> </w:t>
       </w:r>
     </w:p>
     <w:p>
@@ -2924,7 +3772,25 @@
           <w:b/>
           <w:bCs/>
         </w:rPr>
-        <w:t>I included age non linear)</w:t>
+        <w:t xml:space="preserve">I included age </w:t>
+      </w:r>
+      <w:proofErr w:type="spellStart"/>
+      <w:proofErr w:type="gramStart"/>
+      <w:r>
+        <w:rPr>
+          <w:b/>
+          <w:bCs/>
+        </w:rPr>
+        <w:t>non linear</w:t>
+      </w:r>
+      <w:proofErr w:type="spellEnd"/>
+      <w:proofErr w:type="gramEnd"/>
+      <w:r>
+        <w:rPr>
+          <w:b/>
+          <w:bCs/>
+        </w:rPr>
+        <w:t>)</w:t>
       </w:r>
     </w:p>
     <w:p>
@@ -3234,7 +4100,23 @@
           <w:bCs/>
         </w:rPr>
         <w:lastRenderedPageBreak/>
-        <w:t xml:space="preserve">Graph woth all vars, remove age, and the intercept. Use the winner model </w:t>
+        <w:t xml:space="preserve">Graph </w:t>
+      </w:r>
+      <w:proofErr w:type="spellStart"/>
+      <w:r>
+        <w:rPr>
+          <w:b/>
+          <w:bCs/>
+        </w:rPr>
+        <w:t>woth</w:t>
+      </w:r>
+      <w:proofErr w:type="spellEnd"/>
+      <w:r>
+        <w:rPr>
+          <w:b/>
+          <w:bCs/>
+        </w:rPr>
+        <w:t xml:space="preserve"> all vars, remove age, and the intercept. Use the winner model </w:t>
       </w:r>
     </w:p>
     <w:p>
@@ -3425,7 +4307,23 @@
           <w:b/>
           <w:bCs/>
         </w:rPr>
-        <w:t>Graph with int (lo-freq)</w:t>
+        <w:t>Graph with int (lo-</w:t>
+      </w:r>
+      <w:proofErr w:type="spellStart"/>
+      <w:r>
+        <w:rPr>
+          <w:b/>
+          <w:bCs/>
+        </w:rPr>
+        <w:t>freq</w:t>
+      </w:r>
+      <w:proofErr w:type="spellEnd"/>
+      <w:r>
+        <w:rPr>
+          <w:b/>
+          <w:bCs/>
+        </w:rPr>
+        <w:t>)</w:t>
       </w:r>
     </w:p>
     <w:p>
@@ -3446,7 +4344,23 @@
           <w:b/>
           <w:bCs/>
         </w:rPr>
-        <w:t>Graph with int (lo-freq)</w:t>
+        <w:t>Graph with int (lo-</w:t>
+      </w:r>
+      <w:proofErr w:type="spellStart"/>
+      <w:r>
+        <w:rPr>
+          <w:b/>
+          <w:bCs/>
+        </w:rPr>
+        <w:t>freq</w:t>
+      </w:r>
+      <w:proofErr w:type="spellEnd"/>
+      <w:r>
+        <w:rPr>
+          <w:b/>
+          <w:bCs/>
+        </w:rPr>
+        <w:t>)</w:t>
       </w:r>
     </w:p>
     <w:p>
@@ -3467,7 +4381,23 @@
           <w:b/>
           <w:bCs/>
         </w:rPr>
-        <w:t>Graph with int (lo-freq)</w:t>
+        <w:t>Graph with int (lo-</w:t>
+      </w:r>
+      <w:proofErr w:type="spellStart"/>
+      <w:r>
+        <w:rPr>
+          <w:b/>
+          <w:bCs/>
+        </w:rPr>
+        <w:t>freq</w:t>
+      </w:r>
+      <w:proofErr w:type="spellEnd"/>
+      <w:r>
+        <w:rPr>
+          <w:b/>
+          <w:bCs/>
+        </w:rPr>
+        <w:t>)</w:t>
       </w:r>
     </w:p>
     <w:p>
@@ -3488,7 +4418,23 @@
           <w:b/>
           <w:bCs/>
         </w:rPr>
-        <w:t>Graph with int (lo-freq)</w:t>
+        <w:t>Graph with int (lo-</w:t>
+      </w:r>
+      <w:proofErr w:type="spellStart"/>
+      <w:r>
+        <w:rPr>
+          <w:b/>
+          <w:bCs/>
+        </w:rPr>
+        <w:t>freq</w:t>
+      </w:r>
+      <w:proofErr w:type="spellEnd"/>
+      <w:r>
+        <w:rPr>
+          <w:b/>
+          <w:bCs/>
+        </w:rPr>
+        <w:t>)</w:t>
       </w:r>
     </w:p>
     <w:p>
@@ -3509,7 +4455,23 @@
           <w:b/>
           <w:bCs/>
         </w:rPr>
-        <w:t>Graph with int (lo-freq)</w:t>
+        <w:t>Graph with int (lo-</w:t>
+      </w:r>
+      <w:proofErr w:type="spellStart"/>
+      <w:r>
+        <w:rPr>
+          <w:b/>
+          <w:bCs/>
+        </w:rPr>
+        <w:t>freq</w:t>
+      </w:r>
+      <w:proofErr w:type="spellEnd"/>
+      <w:r>
+        <w:rPr>
+          <w:b/>
+          <w:bCs/>
+        </w:rPr>
+        <w:t>)</w:t>
       </w:r>
     </w:p>
     <w:p>
@@ -3526,7 +4488,23 @@
           <w:b/>
           <w:bCs/>
         </w:rPr>
-        <w:t>Create a multipanel showing all the 5 graphs above (joining graphs)</w:t>
+        <w:t xml:space="preserve">Create a </w:t>
+      </w:r>
+      <w:proofErr w:type="spellStart"/>
+      <w:r>
+        <w:rPr>
+          <w:b/>
+          <w:bCs/>
+        </w:rPr>
+        <w:t>multipanel</w:t>
+      </w:r>
+      <w:proofErr w:type="spellEnd"/>
+      <w:r>
+        <w:rPr>
+          <w:b/>
+          <w:bCs/>
+        </w:rPr>
+        <w:t xml:space="preserve"> showing all the 5 graphs above (joining graphs)</w:t>
       </w:r>
     </w:p>
     <w:p>
@@ -3881,7 +4859,23 @@
           <w:bCs/>
         </w:rPr>
         <w:tab/>
-        <w:t xml:space="preserve">Plot within_ovelap with no interaction. </w:t>
+        <w:t xml:space="preserve">Plot </w:t>
+      </w:r>
+      <w:proofErr w:type="spellStart"/>
+      <w:r>
+        <w:rPr>
+          <w:b/>
+          <w:bCs/>
+        </w:rPr>
+        <w:t>within_ovelap</w:t>
+      </w:r>
+      <w:proofErr w:type="spellEnd"/>
+      <w:r>
+        <w:rPr>
+          <w:b/>
+          <w:bCs/>
+        </w:rPr>
+        <w:t xml:space="preserve"> with no interaction. </w:t>
       </w:r>
     </w:p>
     <w:p>
@@ -4110,7 +5104,15 @@
         <w:ind w:left="1440"/>
       </w:pPr>
       <w:r>
-        <w:t>Careful to any large data files, you might want to decide not to push them to the repository (gitignore)</w:t>
+        <w:t>Careful to any large data files, you might want to decide not to push them to the repository (</w:t>
+      </w:r>
+      <w:proofErr w:type="spellStart"/>
+      <w:r>
+        <w:t>gitignore</w:t>
+      </w:r>
+      <w:proofErr w:type="spellEnd"/>
+      <w:r>
+        <w:t>)</w:t>
       </w:r>
     </w:p>
     <w:p>
@@ -4119,8 +5121,231 @@
         <w:ind w:left="2160"/>
       </w:pPr>
       <w:r>
-        <w:t>Maybe don’t save the Raw data sets into the repository (github) as they are very large files, you can save the longitudinal data data sets as it is smaller and maybe small enough to be in the repository</w:t>
-      </w:r>
+        <w:t>Maybe don’t save the Raw data sets into the repository (</w:t>
+      </w:r>
+      <w:proofErr w:type="spellStart"/>
+      <w:r>
+        <w:t>github</w:t>
+      </w:r>
+      <w:proofErr w:type="spellEnd"/>
+      <w:r>
+        <w:t>) as they are very large files, you can save the longitudinal data data sets as it is smaller and maybe small enough to be in the repository</w:t>
+      </w:r>
+    </w:p>
+    <w:p>
+      <w:pPr>
+        <w:spacing w:after="0"/>
+      </w:pPr>
+    </w:p>
+    <w:p>
+      <w:pPr>
+        <w:spacing w:after="0"/>
+      </w:pPr>
+    </w:p>
+    <w:p>
+      <w:pPr>
+        <w:spacing w:after="0"/>
+      </w:pPr>
+    </w:p>
+    <w:p>
+      <w:pPr>
+        <w:spacing w:after="0"/>
+      </w:pPr>
+    </w:p>
+    <w:p>
+      <w:pPr>
+        <w:spacing w:after="0"/>
+      </w:pPr>
+    </w:p>
+    <w:p>
+      <w:pPr>
+        <w:spacing w:after="0"/>
+      </w:pPr>
+    </w:p>
+    <w:p>
+      <w:pPr>
+        <w:spacing w:after="0"/>
+      </w:pPr>
+    </w:p>
+    <w:p>
+      <w:pPr>
+        <w:spacing w:after="0"/>
+      </w:pPr>
+    </w:p>
+    <w:p>
+      <w:pPr>
+        <w:spacing w:after="0"/>
+      </w:pPr>
+    </w:p>
+    <w:p>
+      <w:pPr>
+        <w:spacing w:after="0"/>
+      </w:pPr>
+    </w:p>
+    <w:p>
+      <w:pPr>
+        <w:spacing w:after="0"/>
+      </w:pPr>
+    </w:p>
+    <w:p>
+      <w:pPr>
+        <w:spacing w:after="0"/>
+      </w:pPr>
+    </w:p>
+    <w:p>
+      <w:pPr>
+        <w:spacing w:after="0"/>
+      </w:pPr>
+    </w:p>
+    <w:p>
+      <w:pPr>
+        <w:spacing w:after="0"/>
+      </w:pPr>
+    </w:p>
+    <w:p>
+      <w:pPr>
+        <w:spacing w:after="0"/>
+      </w:pPr>
+    </w:p>
+    <w:p>
+      <w:pPr>
+        <w:spacing w:after="0"/>
+      </w:pPr>
+    </w:p>
+    <w:p>
+      <w:pPr>
+        <w:spacing w:after="0"/>
+      </w:pPr>
+    </w:p>
+    <w:p>
+      <w:pPr>
+        <w:spacing w:after="0"/>
+      </w:pPr>
+    </w:p>
+    <w:p>
+      <w:pPr>
+        <w:spacing w:after="0"/>
+      </w:pPr>
+    </w:p>
+    <w:p>
+      <w:pPr>
+        <w:spacing w:after="0"/>
+      </w:pPr>
+    </w:p>
+    <w:p>
+      <w:pPr>
+        <w:spacing w:after="0"/>
+      </w:pPr>
+    </w:p>
+    <w:p>
+      <w:pPr>
+        <w:spacing w:after="0"/>
+      </w:pPr>
+    </w:p>
+    <w:p>
+      <w:pPr>
+        <w:spacing w:after="0"/>
+      </w:pPr>
+    </w:p>
+    <w:p>
+      <w:pPr>
+        <w:spacing w:after="0"/>
+      </w:pPr>
+    </w:p>
+    <w:p>
+      <w:pPr>
+        <w:spacing w:after="0"/>
+      </w:pPr>
+    </w:p>
+    <w:p>
+      <w:pPr>
+        <w:spacing w:after="0"/>
+      </w:pPr>
+    </w:p>
+    <w:p>
+      <w:pPr>
+        <w:spacing w:after="0"/>
+      </w:pPr>
+    </w:p>
+    <w:p>
+      <w:pPr>
+        <w:spacing w:after="0"/>
+      </w:pPr>
+    </w:p>
+    <w:p>
+      <w:pPr>
+        <w:spacing w:after="0"/>
+      </w:pPr>
+    </w:p>
+    <w:p>
+      <w:pPr>
+        <w:spacing w:after="0"/>
+      </w:pPr>
+    </w:p>
+    <w:p>
+      <w:pPr>
+        <w:spacing w:after="0"/>
+      </w:pPr>
+    </w:p>
+    <w:p>
+      <w:pPr>
+        <w:spacing w:after="0"/>
+      </w:pPr>
+    </w:p>
+    <w:p>
+      <w:pPr>
+        <w:spacing w:after="0"/>
+      </w:pPr>
+    </w:p>
+    <w:p>
+      <w:pPr>
+        <w:spacing w:after="0"/>
+      </w:pPr>
+    </w:p>
+    <w:p>
+      <w:pPr>
+        <w:pStyle w:val="ListParagraph"/>
+        <w:numPr>
+          <w:ilvl w:val="0"/>
+          <w:numId w:val="9"/>
+        </w:numPr>
+        <w:spacing w:after="0"/>
+      </w:pPr>
+      <w:proofErr w:type="spellStart"/>
+      <w:r>
+        <w:lastRenderedPageBreak/>
+        <w:t>Rewview</w:t>
+      </w:r>
+      <w:proofErr w:type="spellEnd"/>
+      <w:r>
+        <w:t xml:space="preserve"> </w:t>
+      </w:r>
+      <w:proofErr w:type="spellStart"/>
+      <w:r>
+        <w:t>layla’s</w:t>
+      </w:r>
+      <w:proofErr w:type="spellEnd"/>
+      <w:r>
+        <w:t xml:space="preserve"> paper</w:t>
+      </w:r>
+    </w:p>
+    <w:p>
+      <w:pPr>
+        <w:pStyle w:val="ListParagraph"/>
+        <w:numPr>
+          <w:ilvl w:val="0"/>
+          <w:numId w:val="9"/>
+        </w:numPr>
+        <w:spacing w:after="0"/>
+      </w:pPr>
+      <w:r>
+        <w:t xml:space="preserve">Write the results </w:t>
+      </w:r>
+    </w:p>
+    <w:p>
+      <w:pPr>
+        <w:spacing w:after="0"/>
+      </w:pPr>
     </w:p>
     <w:p>
       <w:pPr>
@@ -4302,10 +5527,7 @@
         <w:t>RESULTS</w:t>
       </w:r>
       <w:r>
-        <w:t xml:space="preserve"> </w:t>
-      </w:r>
-      <w:r>
-        <w:t>(1500)</w:t>
+        <w:t xml:space="preserve"> (1500)</w:t>
       </w:r>
     </w:p>
     <w:p>
@@ -5461,6 +6683,92 @@
       </w:rPr>
     </w:lvl>
   </w:abstractNum>
+  <w:abstractNum w:abstractNumId="8" w15:restartNumberingAfterBreak="0">
+    <w:nsid w:val="6F876131"/>
+    <w:multiLevelType w:val="hybridMultilevel"/>
+    <w:tmpl w:val="AE686772"/>
+    <w:lvl w:ilvl="0" w:tplc="0809000F">
+      <w:start w:val="1"/>
+      <w:numFmt w:val="decimal"/>
+      <w:lvlText w:val="%1."/>
+      <w:lvlJc w:val="left"/>
+      <w:pPr>
+        <w:ind w:left="720" w:hanging="360"/>
+      </w:pPr>
+    </w:lvl>
+    <w:lvl w:ilvl="1" w:tplc="08090019" w:tentative="1">
+      <w:start w:val="1"/>
+      <w:numFmt w:val="lowerLetter"/>
+      <w:lvlText w:val="%2."/>
+      <w:lvlJc w:val="left"/>
+      <w:pPr>
+        <w:ind w:left="1440" w:hanging="360"/>
+      </w:pPr>
+    </w:lvl>
+    <w:lvl w:ilvl="2" w:tplc="0809001B" w:tentative="1">
+      <w:start w:val="1"/>
+      <w:numFmt w:val="lowerRoman"/>
+      <w:lvlText w:val="%3."/>
+      <w:lvlJc w:val="right"/>
+      <w:pPr>
+        <w:ind w:left="2160" w:hanging="180"/>
+      </w:pPr>
+    </w:lvl>
+    <w:lvl w:ilvl="3" w:tplc="0809000F" w:tentative="1">
+      <w:start w:val="1"/>
+      <w:numFmt w:val="decimal"/>
+      <w:lvlText w:val="%4."/>
+      <w:lvlJc w:val="left"/>
+      <w:pPr>
+        <w:ind w:left="2880" w:hanging="360"/>
+      </w:pPr>
+    </w:lvl>
+    <w:lvl w:ilvl="4" w:tplc="08090019" w:tentative="1">
+      <w:start w:val="1"/>
+      <w:numFmt w:val="lowerLetter"/>
+      <w:lvlText w:val="%5."/>
+      <w:lvlJc w:val="left"/>
+      <w:pPr>
+        <w:ind w:left="3600" w:hanging="360"/>
+      </w:pPr>
+    </w:lvl>
+    <w:lvl w:ilvl="5" w:tplc="0809001B" w:tentative="1">
+      <w:start w:val="1"/>
+      <w:numFmt w:val="lowerRoman"/>
+      <w:lvlText w:val="%6."/>
+      <w:lvlJc w:val="right"/>
+      <w:pPr>
+        <w:ind w:left="4320" w:hanging="180"/>
+      </w:pPr>
+    </w:lvl>
+    <w:lvl w:ilvl="6" w:tplc="0809000F" w:tentative="1">
+      <w:start w:val="1"/>
+      <w:numFmt w:val="decimal"/>
+      <w:lvlText w:val="%7."/>
+      <w:lvlJc w:val="left"/>
+      <w:pPr>
+        <w:ind w:left="5040" w:hanging="360"/>
+      </w:pPr>
+    </w:lvl>
+    <w:lvl w:ilvl="7" w:tplc="08090019" w:tentative="1">
+      <w:start w:val="1"/>
+      <w:numFmt w:val="lowerLetter"/>
+      <w:lvlText w:val="%8."/>
+      <w:lvlJc w:val="left"/>
+      <w:pPr>
+        <w:ind w:left="5760" w:hanging="360"/>
+      </w:pPr>
+    </w:lvl>
+    <w:lvl w:ilvl="8" w:tplc="0809001B" w:tentative="1">
+      <w:start w:val="1"/>
+      <w:numFmt w:val="lowerRoman"/>
+      <w:lvlText w:val="%9."/>
+      <w:lvlJc w:val="right"/>
+      <w:pPr>
+        <w:ind w:left="6480" w:hanging="180"/>
+      </w:pPr>
+    </w:lvl>
+  </w:abstractNum>
   <w:num w:numId="1" w16cid:durableId="1549487031">
     <w:abstractNumId w:val="4"/>
   </w:num>
@@ -5484,6 +6792,9 @@
   </w:num>
   <w:num w:numId="8" w16cid:durableId="1844053285">
     <w:abstractNumId w:val="0"/>
+  </w:num>
+  <w:num w:numId="9" w16cid:durableId="1133671030">
+    <w:abstractNumId w:val="8"/>
   </w:num>
 </w:numbering>
 </file>

</xml_diff>